<commit_message>
Fix Vercel function model to use faster 8B model
</commit_message>
<xml_diff>
--- a/Chapter_4_Implementation_Formatted.docx
+++ b/Chapter_4_Implementation_Formatted.docx
@@ -90,7 +90,7 @@
           <w:i w:val="false"/>
           <w:sz w:val="28"/>
         </w:rPr>
-        <w:t>This chapter documents the implementation of AgriFlow, the smart-farming artefact whose design was set out in Chapter Three. Where Chapter Three described how the system was intended to be built  the layered single-page-application architecture, the entity-relationship model, the technology stack and the security design  this chapter describes what was actually built and how it behaves. The two chapters are parallel in structure so a reader can move between a planned decision and its realised counterpart without effort. The chapter opens with a short reconciliation of plan and artefact, proceeds module-by-module through every major feature, and closes with three end-to-end demonstration scenarios and an evidenced security-implementation section. All file names and line numbers refer to the version of the source current at the time of writing.</w:t>
+        <w:t>This chapter documents the implementation of AgriFlow, the smart-farming artefact whose design was set out in Chapter Three. Where Chapter Three described how the system was intended to be built  the layered single-page-application architecture, the entity-relationship model, the technology stack and the security design  this chapter describes what was actually built and how it behaves. The two chapters are parallel in structure so a reader can move between a planned decision and its realized counterpart without effort. The chapter opens with a short reconciliation of plan and artifact, proceeds module-by-module through every major feature, and closes with three end-to-end demonstration scenarios and an evidenced security-implementation section. All file names and line numbers refer to the version of the source current at the time of writing.</w:t>
       </w:r>
     </w:p>
     <w:p>
@@ -149,6 +149,7 @@
             <w:pPr>
               <w:pStyle w:val="Normal"/>
               <w:widowControl/>
+              <w:suppressAutoHyphens w:val="true"/>
               <w:jc w:val="start"/>
               <w:rPr>
                 <w:rFonts w:eastAsia="ＭＳ 明朝" w:cs=""/>
@@ -179,6 +180,7 @@
             <w:pPr>
               <w:pStyle w:val="Normal"/>
               <w:widowControl/>
+              <w:suppressAutoHyphens w:val="true"/>
               <w:jc w:val="start"/>
               <w:rPr>
                 <w:rFonts w:eastAsia="ＭＳ 明朝" w:cs=""/>
@@ -209,6 +211,7 @@
             <w:pPr>
               <w:pStyle w:val="Normal"/>
               <w:widowControl/>
+              <w:suppressAutoHyphens w:val="true"/>
               <w:jc w:val="start"/>
               <w:rPr>
                 <w:rFonts w:eastAsia="ＭＳ 明朝" w:cs=""/>
@@ -242,6 +245,7 @@
             <w:pPr>
               <w:pStyle w:val="Normal"/>
               <w:widowControl/>
+              <w:suppressAutoHyphens w:val="true"/>
               <w:jc w:val="start"/>
               <w:rPr>
                 <w:rFonts w:eastAsia="ＭＳ 明朝" w:cs=""/>
@@ -271,6 +275,7 @@
             <w:pPr>
               <w:pStyle w:val="Normal"/>
               <w:widowControl/>
+              <w:suppressAutoHyphens w:val="true"/>
               <w:jc w:val="start"/>
               <w:rPr>
                 <w:rFonts w:eastAsia="ＭＳ 明朝" w:cs=""/>
@@ -300,6 +305,7 @@
             <w:pPr>
               <w:pStyle w:val="Normal"/>
               <w:widowControl/>
+              <w:suppressAutoHyphens w:val="true"/>
               <w:jc w:val="start"/>
               <w:rPr>
                 <w:rFonts w:eastAsia="ＭＳ 明朝" w:cs=""/>
@@ -332,6 +338,7 @@
             <w:pPr>
               <w:pStyle w:val="Normal"/>
               <w:widowControl/>
+              <w:suppressAutoHyphens w:val="true"/>
               <w:jc w:val="start"/>
               <w:rPr>
                 <w:rFonts w:eastAsia="ＭＳ 明朝" w:cs=""/>
@@ -361,6 +368,7 @@
             <w:pPr>
               <w:pStyle w:val="Normal"/>
               <w:widowControl/>
+              <w:suppressAutoHyphens w:val="true"/>
               <w:jc w:val="start"/>
               <w:rPr>
                 <w:rFonts w:eastAsia="ＭＳ 明朝" w:cs=""/>
@@ -390,6 +398,7 @@
             <w:pPr>
               <w:pStyle w:val="Normal"/>
               <w:widowControl/>
+              <w:suppressAutoHyphens w:val="true"/>
               <w:jc w:val="start"/>
               <w:rPr>
                 <w:rFonts w:eastAsia="ＭＳ 明朝" w:cs=""/>
@@ -422,6 +431,7 @@
             <w:pPr>
               <w:pStyle w:val="Normal"/>
               <w:widowControl/>
+              <w:suppressAutoHyphens w:val="true"/>
               <w:jc w:val="start"/>
               <w:rPr>
                 <w:rFonts w:eastAsia="ＭＳ 明朝" w:cs=""/>
@@ -451,6 +461,7 @@
             <w:pPr>
               <w:pStyle w:val="Normal"/>
               <w:widowControl/>
+              <w:suppressAutoHyphens w:val="true"/>
               <w:jc w:val="start"/>
               <w:rPr>
                 <w:rFonts w:eastAsia="ＭＳ 明朝" w:cs=""/>
@@ -480,6 +491,7 @@
             <w:pPr>
               <w:pStyle w:val="Normal"/>
               <w:widowControl/>
+              <w:suppressAutoHyphens w:val="true"/>
               <w:jc w:val="start"/>
               <w:rPr>
                 <w:rFonts w:eastAsia="ＭＳ 明朝" w:cs=""/>
@@ -3745,7 +3757,11 @@
         </w:rPr>
       </w:pPr>
       <w:r>
-        <w:rPr/>
+        <w:rPr>
+          <w:i/>
+          <w:color w:val="808080"/>
+          <w:sz w:val="22"/>
+        </w:rPr>
       </w:r>
     </w:p>
     <w:p>
@@ -4036,7 +4052,11 @@
         </w:rPr>
       </w:pPr>
       <w:r>
-        <w:rPr/>
+        <w:rPr>
+          <w:i/>
+          <w:color w:val="808080"/>
+          <w:sz w:val="22"/>
+        </w:rPr>
       </w:r>
     </w:p>
     <w:p>
@@ -4343,7 +4363,11 @@
         </w:rPr>
       </w:pPr>
       <w:r>
-        <w:rPr/>
+        <w:rPr>
+          <w:i/>
+          <w:color w:val="808080"/>
+          <w:sz w:val="22"/>
+        </w:rPr>
         <w:drawing>
           <wp:anchor distT="0" distB="0" distL="0" distR="0" simplePos="0" relativeHeight="21" behindDoc="0" locked="0" layoutInCell="0" allowOverlap="1">
             <wp:simplePos x="0" y="0"/>
@@ -4500,6 +4524,7 @@
         </w:tabs>
         <w:ind w:start="1080" w:hanging="360"/>
       </w:pPr>
+      <w:rPr/>
     </w:lvl>
     <w:lvl w:ilvl="2">
       <w:start w:val="1"/>
@@ -4512,6 +4537,7 @@
         </w:tabs>
         <w:ind w:start="1440" w:hanging="360"/>
       </w:pPr>
+      <w:rPr/>
     </w:lvl>
     <w:lvl w:ilvl="3">
       <w:start w:val="1"/>
@@ -4524,6 +4550,7 @@
         </w:tabs>
         <w:ind w:start="1800" w:hanging="360"/>
       </w:pPr>
+      <w:rPr/>
     </w:lvl>
     <w:lvl w:ilvl="4">
       <w:start w:val="1"/>
@@ -4536,6 +4563,7 @@
         </w:tabs>
         <w:ind w:start="2160" w:hanging="360"/>
       </w:pPr>
+      <w:rPr/>
     </w:lvl>
     <w:lvl w:ilvl="5">
       <w:start w:val="1"/>
@@ -4548,6 +4576,7 @@
         </w:tabs>
         <w:ind w:start="2520" w:hanging="360"/>
       </w:pPr>
+      <w:rPr/>
     </w:lvl>
     <w:lvl w:ilvl="6">
       <w:start w:val="1"/>
@@ -4560,6 +4589,7 @@
         </w:tabs>
         <w:ind w:start="2880" w:hanging="360"/>
       </w:pPr>
+      <w:rPr/>
     </w:lvl>
     <w:lvl w:ilvl="7">
       <w:start w:val="1"/>
@@ -4572,6 +4602,7 @@
         </w:tabs>
         <w:ind w:start="3240" w:hanging="360"/>
       </w:pPr>
+      <w:rPr/>
     </w:lvl>
     <w:lvl w:ilvl="8">
       <w:start w:val="1"/>
@@ -4584,6 +4615,7 @@
         </w:tabs>
         <w:ind w:start="3600" w:hanging="360"/>
       </w:pPr>
+      <w:rPr/>
     </w:lvl>
   </w:abstractNum>
   <w:abstractNum w:abstractNumId="2">
@@ -4613,6 +4645,7 @@
         </w:tabs>
         <w:ind w:start="1080" w:hanging="360"/>
       </w:pPr>
+      <w:rPr/>
     </w:lvl>
     <w:lvl w:ilvl="2">
       <w:start w:val="1"/>
@@ -4625,6 +4658,7 @@
         </w:tabs>
         <w:ind w:start="1440" w:hanging="360"/>
       </w:pPr>
+      <w:rPr/>
     </w:lvl>
     <w:lvl w:ilvl="3">
       <w:start w:val="1"/>
@@ -4637,6 +4671,7 @@
         </w:tabs>
         <w:ind w:start="1800" w:hanging="360"/>
       </w:pPr>
+      <w:rPr/>
     </w:lvl>
     <w:lvl w:ilvl="4">
       <w:start w:val="1"/>
@@ -4649,6 +4684,7 @@
         </w:tabs>
         <w:ind w:start="2160" w:hanging="360"/>
       </w:pPr>
+      <w:rPr/>
     </w:lvl>
     <w:lvl w:ilvl="5">
       <w:start w:val="1"/>
@@ -4661,6 +4697,7 @@
         </w:tabs>
         <w:ind w:start="2520" w:hanging="360"/>
       </w:pPr>
+      <w:rPr/>
     </w:lvl>
     <w:lvl w:ilvl="6">
       <w:start w:val="1"/>
@@ -4673,6 +4710,7 @@
         </w:tabs>
         <w:ind w:start="2880" w:hanging="360"/>
       </w:pPr>
+      <w:rPr/>
     </w:lvl>
     <w:lvl w:ilvl="7">
       <w:start w:val="1"/>
@@ -4685,6 +4723,7 @@
         </w:tabs>
         <w:ind w:start="3240" w:hanging="360"/>
       </w:pPr>
+      <w:rPr/>
     </w:lvl>
     <w:lvl w:ilvl="8">
       <w:start w:val="1"/>
@@ -4697,6 +4736,7 @@
         </w:tabs>
         <w:ind w:start="3600" w:hanging="360"/>
       </w:pPr>
+      <w:rPr/>
     </w:lvl>
   </w:abstractNum>
   <w:abstractNum w:abstractNumId="3">
@@ -4726,6 +4766,7 @@
         </w:tabs>
         <w:ind w:start="1080" w:hanging="360"/>
       </w:pPr>
+      <w:rPr/>
     </w:lvl>
     <w:lvl w:ilvl="2">
       <w:start w:val="1"/>
@@ -4738,6 +4779,7 @@
         </w:tabs>
         <w:ind w:start="1440" w:hanging="360"/>
       </w:pPr>
+      <w:rPr/>
     </w:lvl>
     <w:lvl w:ilvl="3">
       <w:start w:val="1"/>
@@ -4750,6 +4792,7 @@
         </w:tabs>
         <w:ind w:start="1800" w:hanging="360"/>
       </w:pPr>
+      <w:rPr/>
     </w:lvl>
     <w:lvl w:ilvl="4">
       <w:start w:val="1"/>
@@ -4762,6 +4805,7 @@
         </w:tabs>
         <w:ind w:start="2160" w:hanging="360"/>
       </w:pPr>
+      <w:rPr/>
     </w:lvl>
     <w:lvl w:ilvl="5">
       <w:start w:val="1"/>
@@ -4774,6 +4818,7 @@
         </w:tabs>
         <w:ind w:start="2520" w:hanging="360"/>
       </w:pPr>
+      <w:rPr/>
     </w:lvl>
     <w:lvl w:ilvl="6">
       <w:start w:val="1"/>
@@ -4786,6 +4831,7 @@
         </w:tabs>
         <w:ind w:start="2880" w:hanging="360"/>
       </w:pPr>
+      <w:rPr/>
     </w:lvl>
     <w:lvl w:ilvl="7">
       <w:start w:val="1"/>
@@ -4798,6 +4844,7 @@
         </w:tabs>
         <w:ind w:start="3240" w:hanging="360"/>
       </w:pPr>
+      <w:rPr/>
     </w:lvl>
     <w:lvl w:ilvl="8">
       <w:start w:val="1"/>
@@ -4810,6 +4857,7 @@
         </w:tabs>
         <w:ind w:start="3600" w:hanging="360"/>
       </w:pPr>
+      <w:rPr/>
     </w:lvl>
   </w:abstractNum>
   <w:abstractNum w:abstractNumId="4">
@@ -4837,6 +4885,7 @@
         </w:tabs>
         <w:ind w:start="1080" w:hanging="360"/>
       </w:pPr>
+      <w:rPr/>
     </w:lvl>
     <w:lvl w:ilvl="2">
       <w:start w:val="1"/>
@@ -4849,6 +4898,7 @@
         </w:tabs>
         <w:ind w:start="1440" w:hanging="360"/>
       </w:pPr>
+      <w:rPr/>
     </w:lvl>
     <w:lvl w:ilvl="3">
       <w:start w:val="1"/>
@@ -4861,6 +4911,7 @@
         </w:tabs>
         <w:ind w:start="1800" w:hanging="360"/>
       </w:pPr>
+      <w:rPr/>
     </w:lvl>
     <w:lvl w:ilvl="4">
       <w:start w:val="1"/>
@@ -4873,6 +4924,7 @@
         </w:tabs>
         <w:ind w:start="2160" w:hanging="360"/>
       </w:pPr>
+      <w:rPr/>
     </w:lvl>
     <w:lvl w:ilvl="5">
       <w:start w:val="1"/>
@@ -4885,6 +4937,7 @@
         </w:tabs>
         <w:ind w:start="2520" w:hanging="360"/>
       </w:pPr>
+      <w:rPr/>
     </w:lvl>
     <w:lvl w:ilvl="6">
       <w:start w:val="1"/>
@@ -4897,6 +4950,7 @@
         </w:tabs>
         <w:ind w:start="2880" w:hanging="360"/>
       </w:pPr>
+      <w:rPr/>
     </w:lvl>
     <w:lvl w:ilvl="7">
       <w:start w:val="1"/>
@@ -4909,6 +4963,7 @@
         </w:tabs>
         <w:ind w:start="3240" w:hanging="360"/>
       </w:pPr>
+      <w:rPr/>
     </w:lvl>
     <w:lvl w:ilvl="8">
       <w:start w:val="1"/>
@@ -4921,6 +4976,7 @@
         </w:tabs>
         <w:ind w:start="3600" w:hanging="360"/>
       </w:pPr>
+      <w:rPr/>
     </w:lvl>
   </w:abstractNum>
   <w:abstractNum w:abstractNumId="5">
@@ -4948,6 +5004,7 @@
         </w:tabs>
         <w:ind w:start="1080" w:hanging="360"/>
       </w:pPr>
+      <w:rPr/>
     </w:lvl>
     <w:lvl w:ilvl="2">
       <w:start w:val="1"/>
@@ -4960,6 +5017,7 @@
         </w:tabs>
         <w:ind w:start="1440" w:hanging="360"/>
       </w:pPr>
+      <w:rPr/>
     </w:lvl>
     <w:lvl w:ilvl="3">
       <w:start w:val="1"/>
@@ -4972,6 +5030,7 @@
         </w:tabs>
         <w:ind w:start="1800" w:hanging="360"/>
       </w:pPr>
+      <w:rPr/>
     </w:lvl>
     <w:lvl w:ilvl="4">
       <w:start w:val="1"/>
@@ -4984,6 +5043,7 @@
         </w:tabs>
         <w:ind w:start="2160" w:hanging="360"/>
       </w:pPr>
+      <w:rPr/>
     </w:lvl>
     <w:lvl w:ilvl="5">
       <w:start w:val="1"/>
@@ -4996,6 +5056,7 @@
         </w:tabs>
         <w:ind w:start="2520" w:hanging="360"/>
       </w:pPr>
+      <w:rPr/>
     </w:lvl>
     <w:lvl w:ilvl="6">
       <w:start w:val="1"/>
@@ -5008,6 +5069,7 @@
         </w:tabs>
         <w:ind w:start="2880" w:hanging="360"/>
       </w:pPr>
+      <w:rPr/>
     </w:lvl>
     <w:lvl w:ilvl="7">
       <w:start w:val="1"/>
@@ -5020,6 +5082,7 @@
         </w:tabs>
         <w:ind w:start="3240" w:hanging="360"/>
       </w:pPr>
+      <w:rPr/>
     </w:lvl>
     <w:lvl w:ilvl="8">
       <w:start w:val="1"/>
@@ -5032,6 +5095,7 @@
         </w:tabs>
         <w:ind w:start="3600" w:hanging="360"/>
       </w:pPr>
+      <w:rPr/>
     </w:lvl>
   </w:abstractNum>
   <w:abstractNum w:abstractNumId="6">
@@ -5059,6 +5123,7 @@
         </w:tabs>
         <w:ind w:start="1080" w:hanging="360"/>
       </w:pPr>
+      <w:rPr/>
     </w:lvl>
     <w:lvl w:ilvl="2">
       <w:start w:val="1"/>
@@ -5071,6 +5136,7 @@
         </w:tabs>
         <w:ind w:start="1440" w:hanging="360"/>
       </w:pPr>
+      <w:rPr/>
     </w:lvl>
     <w:lvl w:ilvl="3">
       <w:start w:val="1"/>
@@ -5083,6 +5149,7 @@
         </w:tabs>
         <w:ind w:start="1800" w:hanging="360"/>
       </w:pPr>
+      <w:rPr/>
     </w:lvl>
     <w:lvl w:ilvl="4">
       <w:start w:val="1"/>
@@ -5095,6 +5162,7 @@
         </w:tabs>
         <w:ind w:start="2160" w:hanging="360"/>
       </w:pPr>
+      <w:rPr/>
     </w:lvl>
     <w:lvl w:ilvl="5">
       <w:start w:val="1"/>
@@ -5107,6 +5175,7 @@
         </w:tabs>
         <w:ind w:start="2520" w:hanging="360"/>
       </w:pPr>
+      <w:rPr/>
     </w:lvl>
     <w:lvl w:ilvl="6">
       <w:start w:val="1"/>
@@ -5119,6 +5188,7 @@
         </w:tabs>
         <w:ind w:start="2880" w:hanging="360"/>
       </w:pPr>
+      <w:rPr/>
     </w:lvl>
     <w:lvl w:ilvl="7">
       <w:start w:val="1"/>
@@ -5131,6 +5201,7 @@
         </w:tabs>
         <w:ind w:start="3240" w:hanging="360"/>
       </w:pPr>
+      <w:rPr/>
     </w:lvl>
     <w:lvl w:ilvl="8">
       <w:start w:val="1"/>
@@ -5143,6 +5214,7 @@
         </w:tabs>
         <w:ind w:start="3600" w:hanging="360"/>
       </w:pPr>
+      <w:rPr/>
     </w:lvl>
   </w:abstractNum>
   <w:abstractNum w:abstractNumId="7">
@@ -5293,7 +5365,7 @@
   <w:docDefaults>
     <w:rPrDefault>
       <w:rPr>
-        <w:rFonts w:ascii="Cambria" w:hAnsi="Cambria" w:eastAsia="ＭＳ 明朝" w:cs="" w:asciiTheme="minorHAnsi" w:cstheme="minorBidi" w:eastAsiaTheme="minorEastAsia" w:hAnsiTheme="minorHAnsi"/>
+        <w:rFonts w:ascii="Cambria" w:hAnsi="Cambria" w:eastAsia="" w:cs="" w:asciiTheme="minorHAnsi" w:cstheme="minorBidi" w:eastAsiaTheme="minorEastAsia" w:hAnsiTheme="minorHAnsi"/>
         <w:sz w:val="22"/>
         <w:szCs w:val="22"/>
         <w:lang w:val="en-US" w:eastAsia="en-US" w:bidi="ar-SA"/>
@@ -5450,6 +5522,7 @@
     <w:rsid w:val="00fc693f"/>
     <w:pPr>
       <w:widowControl/>
+      <w:suppressAutoHyphens w:val="true"/>
       <w:bidi w:val="0"/>
       <w:spacing w:lineRule="auto" w:line="360" w:before="0" w:after="0"/>
       <w:jc w:val="start"/>
@@ -5478,7 +5551,7 @@
       <w:outlineLvl w:val="0"/>
     </w:pPr>
     <w:rPr>
-      <w:rFonts w:ascii="Calibri" w:hAnsi="Calibri" w:eastAsia="ＭＳ ゴシック" w:cs="" w:asciiTheme="majorHAnsi" w:cstheme="majorBidi" w:eastAsiaTheme="majorEastAsia" w:hAnsiTheme="majorHAnsi"/>
+      <w:rFonts w:ascii="Calibri" w:hAnsi="Calibri" w:eastAsia="" w:cs="" w:asciiTheme="majorHAnsi" w:cstheme="majorBidi" w:eastAsiaTheme="majorEastAsia" w:hAnsiTheme="majorHAnsi"/>
       <w:b/>
       <w:bCs/>
       <w:color w:val="000000"/>
@@ -5502,7 +5575,7 @@
       <w:outlineLvl w:val="1"/>
     </w:pPr>
     <w:rPr>
-      <w:rFonts w:ascii="Calibri" w:hAnsi="Calibri" w:eastAsia="ＭＳ ゴシック" w:cs="" w:asciiTheme="majorHAnsi" w:cstheme="majorBidi" w:eastAsiaTheme="majorEastAsia" w:hAnsiTheme="majorHAnsi"/>
+      <w:rFonts w:ascii="Calibri" w:hAnsi="Calibri" w:eastAsia="" w:cs="" w:asciiTheme="majorHAnsi" w:cstheme="majorBidi" w:eastAsiaTheme="majorEastAsia" w:hAnsiTheme="majorHAnsi"/>
       <w:b/>
       <w:bCs/>
       <w:color w:val="000000"/>
@@ -5526,7 +5599,7 @@
       <w:outlineLvl w:val="2"/>
     </w:pPr>
     <w:rPr>
-      <w:rFonts w:ascii="Calibri" w:hAnsi="Calibri" w:eastAsia="ＭＳ ゴシック" w:cs="" w:asciiTheme="majorHAnsi" w:cstheme="majorBidi" w:eastAsiaTheme="majorEastAsia" w:hAnsiTheme="majorHAnsi"/>
+      <w:rFonts w:ascii="Calibri" w:hAnsi="Calibri" w:eastAsia="" w:cs="" w:asciiTheme="majorHAnsi" w:cstheme="majorBidi" w:eastAsiaTheme="majorEastAsia" w:hAnsiTheme="majorHAnsi"/>
       <w:b/>
       <w:bCs/>
       <w:i/>
@@ -5551,7 +5624,7 @@
       <w:outlineLvl w:val="3"/>
     </w:pPr>
     <w:rPr>
-      <w:rFonts w:ascii="Calibri" w:hAnsi="Calibri" w:eastAsia="ＭＳ ゴシック" w:cs="" w:asciiTheme="majorHAnsi" w:cstheme="majorBidi" w:eastAsiaTheme="majorEastAsia" w:hAnsiTheme="majorHAnsi"/>
+      <w:rFonts w:ascii="Calibri" w:hAnsi="Calibri" w:eastAsia="" w:cs="" w:asciiTheme="majorHAnsi" w:cstheme="majorBidi" w:eastAsiaTheme="majorEastAsia" w:hAnsiTheme="majorHAnsi"/>
       <w:b/>
       <w:bCs/>
       <w:i/>
@@ -5576,7 +5649,7 @@
       <w:outlineLvl w:val="4"/>
     </w:pPr>
     <w:rPr>
-      <w:rFonts w:ascii="Calibri" w:hAnsi="Calibri" w:eastAsia="ＭＳ ゴシック" w:cs="" w:asciiTheme="majorHAnsi" w:cstheme="majorBidi" w:eastAsiaTheme="majorEastAsia" w:hAnsiTheme="majorHAnsi"/>
+      <w:rFonts w:ascii="Calibri" w:hAnsi="Calibri" w:eastAsia="" w:cs="" w:asciiTheme="majorHAnsi" w:cstheme="majorBidi" w:eastAsiaTheme="majorEastAsia" w:hAnsiTheme="majorHAnsi"/>
       <w:color w:themeColor="accent1" w:themeShade="7f" w:val="243F60"/>
     </w:rPr>
   </w:style>
@@ -5597,7 +5670,7 @@
       <w:outlineLvl w:val="5"/>
     </w:pPr>
     <w:rPr>
-      <w:rFonts w:ascii="Calibri" w:hAnsi="Calibri" w:eastAsia="ＭＳ ゴシック" w:cs="" w:asciiTheme="majorHAnsi" w:cstheme="majorBidi" w:eastAsiaTheme="majorEastAsia" w:hAnsiTheme="majorHAnsi"/>
+      <w:rFonts w:ascii="Calibri" w:hAnsi="Calibri" w:eastAsia="" w:cs="" w:asciiTheme="majorHAnsi" w:cstheme="majorBidi" w:eastAsiaTheme="majorEastAsia" w:hAnsiTheme="majorHAnsi"/>
       <w:i/>
       <w:iCs/>
       <w:color w:themeColor="accent1" w:themeShade="7f" w:val="243F60"/>
@@ -5620,7 +5693,7 @@
       <w:outlineLvl w:val="6"/>
     </w:pPr>
     <w:rPr>
-      <w:rFonts w:ascii="Calibri" w:hAnsi="Calibri" w:eastAsia="ＭＳ ゴシック" w:cs="" w:asciiTheme="majorHAnsi" w:cstheme="majorBidi" w:eastAsiaTheme="majorEastAsia" w:hAnsiTheme="majorHAnsi"/>
+      <w:rFonts w:ascii="Calibri" w:hAnsi="Calibri" w:eastAsia="" w:cs="" w:asciiTheme="majorHAnsi" w:cstheme="majorBidi" w:eastAsiaTheme="majorEastAsia" w:hAnsiTheme="majorHAnsi"/>
       <w:i/>
       <w:iCs/>
       <w:color w:themeColor="dark1" w:themeTint="bf" w:val="404040"/>
@@ -5643,7 +5716,7 @@
       <w:outlineLvl w:val="7"/>
     </w:pPr>
     <w:rPr>
-      <w:rFonts w:ascii="Calibri" w:hAnsi="Calibri" w:eastAsia="ＭＳ ゴシック" w:cs="" w:asciiTheme="majorHAnsi" w:cstheme="majorBidi" w:eastAsiaTheme="majorEastAsia" w:hAnsiTheme="majorHAnsi"/>
+      <w:rFonts w:ascii="Calibri" w:hAnsi="Calibri" w:eastAsia="" w:cs="" w:asciiTheme="majorHAnsi" w:cstheme="majorBidi" w:eastAsiaTheme="majorEastAsia" w:hAnsiTheme="majorHAnsi"/>
       <w:color w:themeColor="accent1" w:val="4F81BD"/>
       <w:sz w:val="20"/>
       <w:szCs w:val="20"/>
@@ -5666,7 +5739,7 @@
       <w:outlineLvl w:val="8"/>
     </w:pPr>
     <w:rPr>
-      <w:rFonts w:ascii="Calibri" w:hAnsi="Calibri" w:eastAsia="ＭＳ ゴシック" w:cs="" w:asciiTheme="majorHAnsi" w:cstheme="majorBidi" w:eastAsiaTheme="majorEastAsia" w:hAnsiTheme="majorHAnsi"/>
+      <w:rFonts w:ascii="Calibri" w:hAnsi="Calibri" w:eastAsia="" w:cs="" w:asciiTheme="majorHAnsi" w:cstheme="majorBidi" w:eastAsiaTheme="majorEastAsia" w:hAnsiTheme="majorHAnsi"/>
       <w:i/>
       <w:iCs/>
       <w:color w:themeColor="dark1" w:themeTint="bf" w:val="404040"/>
@@ -5708,7 +5781,7 @@
     <w:qFormat/>
     <w:rsid w:val="00fc693f"/>
     <w:rPr>
-      <w:rFonts w:ascii="Calibri" w:hAnsi="Calibri" w:eastAsia="ＭＳ ゴシック" w:cs="" w:asciiTheme="majorHAnsi" w:cstheme="majorBidi" w:eastAsiaTheme="majorEastAsia" w:hAnsiTheme="majorHAnsi"/>
+      <w:rFonts w:ascii="Calibri" w:hAnsi="Calibri" w:eastAsia="" w:cs="" w:asciiTheme="majorHAnsi" w:cstheme="majorBidi" w:eastAsiaTheme="majorEastAsia" w:hAnsiTheme="majorHAnsi"/>
       <w:b/>
       <w:bCs/>
       <w:color w:themeColor="accent1" w:themeShade="bf" w:val="365F91"/>
@@ -5724,7 +5797,7 @@
     <w:qFormat/>
     <w:rsid w:val="00fc693f"/>
     <w:rPr>
-      <w:rFonts w:ascii="Calibri" w:hAnsi="Calibri" w:eastAsia="ＭＳ ゴシック" w:cs="" w:asciiTheme="majorHAnsi" w:cstheme="majorBidi" w:eastAsiaTheme="majorEastAsia" w:hAnsiTheme="majorHAnsi"/>
+      <w:rFonts w:ascii="Calibri" w:hAnsi="Calibri" w:eastAsia="" w:cs="" w:asciiTheme="majorHAnsi" w:cstheme="majorBidi" w:eastAsiaTheme="majorEastAsia" w:hAnsiTheme="majorHAnsi"/>
       <w:b/>
       <w:bCs/>
       <w:color w:themeColor="accent1" w:val="4F81BD"/>
@@ -5740,7 +5813,7 @@
     <w:qFormat/>
     <w:rsid w:val="00fc693f"/>
     <w:rPr>
-      <w:rFonts w:ascii="Calibri" w:hAnsi="Calibri" w:eastAsia="ＭＳ ゴシック" w:cs="" w:asciiTheme="majorHAnsi" w:cstheme="majorBidi" w:eastAsiaTheme="majorEastAsia" w:hAnsiTheme="majorHAnsi"/>
+      <w:rFonts w:ascii="Calibri" w:hAnsi="Calibri" w:eastAsia="" w:cs="" w:asciiTheme="majorHAnsi" w:cstheme="majorBidi" w:eastAsiaTheme="majorEastAsia" w:hAnsiTheme="majorHAnsi"/>
       <w:b/>
       <w:bCs/>
       <w:color w:themeColor="accent1" w:val="4F81BD"/>
@@ -5754,7 +5827,7 @@
     <w:qFormat/>
     <w:rsid w:val="00fc693f"/>
     <w:rPr>
-      <w:rFonts w:ascii="Calibri" w:hAnsi="Calibri" w:eastAsia="ＭＳ ゴシック" w:cs="" w:asciiTheme="majorHAnsi" w:cstheme="majorBidi" w:eastAsiaTheme="majorEastAsia" w:hAnsiTheme="majorHAnsi"/>
+      <w:rFonts w:ascii="Calibri" w:hAnsi="Calibri" w:eastAsia="" w:cs="" w:asciiTheme="majorHAnsi" w:cstheme="majorBidi" w:eastAsiaTheme="majorEastAsia" w:hAnsiTheme="majorHAnsi"/>
       <w:color w:themeColor="dark2" w:themeShade="bf" w:val="17365D"/>
       <w:spacing w:val="5"/>
       <w:kern w:val="2"/>
@@ -5770,7 +5843,7 @@
     <w:qFormat/>
     <w:rsid w:val="00fc693f"/>
     <w:rPr>
-      <w:rFonts w:ascii="Calibri" w:hAnsi="Calibri" w:eastAsia="ＭＳ ゴシック" w:cs="" w:asciiTheme="majorHAnsi" w:cstheme="majorBidi" w:eastAsiaTheme="majorEastAsia" w:hAnsiTheme="majorHAnsi"/>
+      <w:rFonts w:ascii="Calibri" w:hAnsi="Calibri" w:eastAsia="" w:cs="" w:asciiTheme="majorHAnsi" w:cstheme="majorBidi" w:eastAsiaTheme="majorEastAsia" w:hAnsiTheme="majorHAnsi"/>
       <w:i/>
       <w:iCs/>
       <w:color w:themeColor="accent1" w:val="4F81BD"/>
@@ -5843,7 +5916,7 @@
     <w:qFormat/>
     <w:rsid w:val="00fc693f"/>
     <w:rPr>
-      <w:rFonts w:ascii="Calibri" w:hAnsi="Calibri" w:eastAsia="ＭＳ ゴシック" w:cs="" w:asciiTheme="majorHAnsi" w:cstheme="majorBidi" w:eastAsiaTheme="majorEastAsia" w:hAnsiTheme="majorHAnsi"/>
+      <w:rFonts w:ascii="Calibri" w:hAnsi="Calibri" w:eastAsia="" w:cs="" w:asciiTheme="majorHAnsi" w:cstheme="majorBidi" w:eastAsiaTheme="majorEastAsia" w:hAnsiTheme="majorHAnsi"/>
       <w:b/>
       <w:bCs/>
       <w:i/>
@@ -5860,7 +5933,7 @@
     <w:qFormat/>
     <w:rsid w:val="00fc693f"/>
     <w:rPr>
-      <w:rFonts w:ascii="Calibri" w:hAnsi="Calibri" w:eastAsia="ＭＳ ゴシック" w:cs="" w:asciiTheme="majorHAnsi" w:cstheme="majorBidi" w:eastAsiaTheme="majorEastAsia" w:hAnsiTheme="majorHAnsi"/>
+      <w:rFonts w:ascii="Calibri" w:hAnsi="Calibri" w:eastAsia="" w:cs="" w:asciiTheme="majorHAnsi" w:cstheme="majorBidi" w:eastAsiaTheme="majorEastAsia" w:hAnsiTheme="majorHAnsi"/>
       <w:color w:themeColor="accent1" w:themeShade="7f" w:val="243F60"/>
     </w:rPr>
   </w:style>
@@ -5873,7 +5946,7 @@
     <w:qFormat/>
     <w:rsid w:val="00fc693f"/>
     <w:rPr>
-      <w:rFonts w:ascii="Calibri" w:hAnsi="Calibri" w:eastAsia="ＭＳ ゴシック" w:cs="" w:asciiTheme="majorHAnsi" w:cstheme="majorBidi" w:eastAsiaTheme="majorEastAsia" w:hAnsiTheme="majorHAnsi"/>
+      <w:rFonts w:ascii="Calibri" w:hAnsi="Calibri" w:eastAsia="" w:cs="" w:asciiTheme="majorHAnsi" w:cstheme="majorBidi" w:eastAsiaTheme="majorEastAsia" w:hAnsiTheme="majorHAnsi"/>
       <w:i/>
       <w:iCs/>
       <w:color w:themeColor="accent1" w:themeShade="7f" w:val="243F60"/>
@@ -5888,7 +5961,7 @@
     <w:qFormat/>
     <w:rsid w:val="00fc693f"/>
     <w:rPr>
-      <w:rFonts w:ascii="Calibri" w:hAnsi="Calibri" w:eastAsia="ＭＳ ゴシック" w:cs="" w:asciiTheme="majorHAnsi" w:cstheme="majorBidi" w:eastAsiaTheme="majorEastAsia" w:hAnsiTheme="majorHAnsi"/>
+      <w:rFonts w:ascii="Calibri" w:hAnsi="Calibri" w:eastAsia="" w:cs="" w:asciiTheme="majorHAnsi" w:cstheme="majorBidi" w:eastAsiaTheme="majorEastAsia" w:hAnsiTheme="majorHAnsi"/>
       <w:i/>
       <w:iCs/>
       <w:color w:themeColor="dark1" w:themeTint="bf" w:val="404040"/>
@@ -5903,7 +5976,7 @@
     <w:qFormat/>
     <w:rsid w:val="00fc693f"/>
     <w:rPr>
-      <w:rFonts w:ascii="Calibri" w:hAnsi="Calibri" w:eastAsia="ＭＳ ゴシック" w:cs="" w:asciiTheme="majorHAnsi" w:cstheme="majorBidi" w:eastAsiaTheme="majorEastAsia" w:hAnsiTheme="majorHAnsi"/>
+      <w:rFonts w:ascii="Calibri" w:hAnsi="Calibri" w:eastAsia="" w:cs="" w:asciiTheme="majorHAnsi" w:cstheme="majorBidi" w:eastAsiaTheme="majorEastAsia" w:hAnsiTheme="majorHAnsi"/>
       <w:color w:themeColor="accent1" w:val="4F81BD"/>
       <w:sz w:val="20"/>
       <w:szCs w:val="20"/>
@@ -5918,7 +5991,7 @@
     <w:qFormat/>
     <w:rsid w:val="00fc693f"/>
     <w:rPr>
-      <w:rFonts w:ascii="Calibri" w:hAnsi="Calibri" w:eastAsia="ＭＳ ゴシック" w:cs="" w:asciiTheme="majorHAnsi" w:cstheme="majorBidi" w:eastAsiaTheme="majorEastAsia" w:hAnsiTheme="majorHAnsi"/>
+      <w:rFonts w:ascii="Calibri" w:hAnsi="Calibri" w:eastAsia="" w:cs="" w:asciiTheme="majorHAnsi" w:cstheme="majorBidi" w:eastAsiaTheme="majorEastAsia" w:hAnsiTheme="majorHAnsi"/>
       <w:i/>
       <w:iCs/>
       <w:color w:themeColor="dark1" w:themeTint="bf" w:val="404040"/>
@@ -6151,12 +6224,13 @@
     <w:rsid w:val="00fc693f"/>
     <w:pPr>
       <w:widowControl/>
+      <w:suppressAutoHyphens w:val="true"/>
       <w:bidi w:val="0"/>
       <w:spacing w:lineRule="auto" w:line="240" w:before="0" w:after="0"/>
       <w:jc w:val="start"/>
     </w:pPr>
     <w:rPr>
-      <w:rFonts w:ascii="Cambria" w:hAnsi="Cambria" w:eastAsia="ＭＳ 明朝" w:cs="" w:asciiTheme="minorHAnsi" w:cstheme="minorBidi" w:eastAsiaTheme="minorEastAsia" w:hAnsiTheme="minorHAnsi"/>
+      <w:rFonts w:ascii="Cambria" w:hAnsi="Cambria" w:eastAsia="" w:cs="" w:asciiTheme="minorHAnsi" w:cstheme="minorBidi" w:eastAsiaTheme="minorEastAsia" w:hAnsiTheme="minorHAnsi"/>
       <w:color w:val="auto"/>
       <w:kern w:val="0"/>
       <w:sz w:val="22"/>
@@ -6180,7 +6254,7 @@
       <w:contextualSpacing/>
     </w:pPr>
     <w:rPr>
-      <w:rFonts w:ascii="Calibri" w:hAnsi="Calibri" w:eastAsia="ＭＳ ゴシック" w:cs="" w:asciiTheme="majorHAnsi" w:cstheme="majorBidi" w:eastAsiaTheme="majorEastAsia" w:hAnsiTheme="majorHAnsi"/>
+      <w:rFonts w:ascii="Calibri" w:hAnsi="Calibri" w:eastAsia="" w:cs="" w:asciiTheme="majorHAnsi" w:cstheme="majorBidi" w:eastAsiaTheme="majorEastAsia" w:hAnsiTheme="majorHAnsi"/>
       <w:color w:themeColor="dark2" w:themeShade="bf" w:val="17365D"/>
       <w:spacing w:val="5"/>
       <w:kern w:val="2"/>
@@ -6198,7 +6272,7 @@
     <w:rsid w:val="00fc693f"/>
     <w:pPr/>
     <w:rPr>
-      <w:rFonts w:ascii="Calibri" w:hAnsi="Calibri" w:eastAsia="ＭＳ ゴシック" w:cs="" w:asciiTheme="majorHAnsi" w:cstheme="majorBidi" w:eastAsiaTheme="majorEastAsia" w:hAnsiTheme="majorHAnsi"/>
+      <w:rFonts w:ascii="Calibri" w:hAnsi="Calibri" w:eastAsia="" w:cs="" w:asciiTheme="majorHAnsi" w:cstheme="majorBidi" w:eastAsiaTheme="majorEastAsia" w:hAnsiTheme="majorHAnsi"/>
       <w:i/>
       <w:iCs/>
       <w:color w:themeColor="accent1" w:val="4F81BD"/>
@@ -6431,12 +6505,13 @@
         <w:tab w:val="left" w:pos="3456" w:leader="none"/>
         <w:tab w:val="left" w:pos="4032" w:leader="none"/>
       </w:tabs>
+      <w:suppressAutoHyphens w:val="true"/>
       <w:bidi w:val="0"/>
       <w:spacing w:lineRule="auto" w:line="276" w:before="0" w:after="200"/>
       <w:jc w:val="start"/>
     </w:pPr>
     <w:rPr>
-      <w:rFonts w:ascii="Courier" w:hAnsi="Courier" w:eastAsia="ＭＳ 明朝" w:cs="" w:cstheme="minorBidi" w:eastAsiaTheme="minorEastAsia"/>
+      <w:rFonts w:ascii="Courier" w:hAnsi="Courier" w:eastAsia="" w:cs="" w:cstheme="minorBidi" w:eastAsiaTheme="minorEastAsia"/>
       <w:color w:val="auto"/>
       <w:kern w:val="0"/>
       <w:sz w:val="20"/>
@@ -6507,13 +6582,14 @@
     <w:qFormat/>
     <w:pPr>
       <w:widowControl/>
+      <w:suppressAutoHyphens w:val="true"/>
       <w:bidi w:val="0"/>
       <w:spacing w:lineRule="auto" w:line="240" w:before="0" w:after="120"/>
       <w:ind w:start="567"/>
       <w:jc w:val="start"/>
     </w:pPr>
     <w:rPr>
-      <w:rFonts w:ascii="Courier New" w:hAnsi="Courier New" w:eastAsia="ＭＳ 明朝" w:cs="" w:cstheme="minorBidi" w:eastAsiaTheme="minorEastAsia"/>
+      <w:rFonts w:ascii="Courier New" w:hAnsi="Courier New" w:eastAsia="" w:cs="" w:cstheme="minorBidi" w:eastAsiaTheme="minorEastAsia"/>
       <w:color w:val="auto"/>
       <w:kern w:val="0"/>
       <w:sz w:val="20"/>
@@ -9653,7 +9729,6 @@
       <w:pPr>
         <w:spacing w:before="0" w:after="0" w:line="240" w:lineRule="auto"/>
       </w:pPr>
-      <w:rPr/>
       <w:tblPr/>
       <w:tcPr>
         <w:tcBorders>
@@ -9799,7 +9874,6 @@
       <w:pPr>
         <w:spacing w:before="0" w:after="0" w:line="240" w:lineRule="auto"/>
       </w:pPr>
-      <w:rPr/>
       <w:tblPr/>
       <w:tcPr>
         <w:tcBorders>
@@ -9945,7 +10019,6 @@
       <w:pPr>
         <w:spacing w:before="0" w:after="0" w:line="240" w:lineRule="auto"/>
       </w:pPr>
-      <w:rPr/>
       <w:tblPr/>
       <w:tcPr>
         <w:tcBorders>
@@ -10091,7 +10164,6 @@
       <w:pPr>
         <w:spacing w:before="0" w:after="0" w:line="240" w:lineRule="auto"/>
       </w:pPr>
-      <w:rPr/>
       <w:tblPr/>
       <w:tcPr>
         <w:tcBorders>
@@ -10237,7 +10309,6 @@
       <w:pPr>
         <w:spacing w:before="0" w:after="0" w:line="240" w:lineRule="auto"/>
       </w:pPr>
-      <w:rPr/>
       <w:tblPr/>
       <w:tcPr>
         <w:tcBorders>
@@ -10383,7 +10454,6 @@
       <w:pPr>
         <w:spacing w:before="0" w:after="0" w:line="240" w:lineRule="auto"/>
       </w:pPr>
-      <w:rPr/>
       <w:tblPr/>
       <w:tcPr>
         <w:tcBorders>
@@ -10529,7 +10599,6 @@
       <w:pPr>
         <w:spacing w:before="0" w:after="0" w:line="240" w:lineRule="auto"/>
       </w:pPr>
-      <w:rPr/>
       <w:tblPr/>
       <w:tcPr>
         <w:tcBorders>

</xml_diff>

<commit_message>
modified:   vercel.json 	modified:   vite.config.ts
</commit_message>
<xml_diff>
--- a/Chapter_4_Implementation_Formatted.docx
+++ b/Chapter_4_Implementation_Formatted.docx
@@ -1760,7 +1760,7 @@
       <w:r>
         <w:rPr/>
         <w:drawing>
-          <wp:anchor distT="0" distB="0" distL="0" distR="0" simplePos="0" relativeHeight="13" behindDoc="0" locked="0" layoutInCell="0" allowOverlap="1">
+          <wp:anchor distT="0" distB="0" distL="0" distR="0" simplePos="0" relativeHeight="11" behindDoc="0" locked="0" layoutInCell="0" allowOverlap="1">
             <wp:simplePos x="0" y="0"/>
             <wp:positionH relativeFrom="column">
               <wp:align>center</wp:align>
@@ -1831,7 +1831,7 @@
       <w:r>
         <w:rPr/>
         <w:drawing>
-          <wp:anchor distT="0" distB="0" distL="0" distR="0" simplePos="0" relativeHeight="12" behindDoc="0" locked="0" layoutInCell="0" allowOverlap="1">
+          <wp:anchor distT="0" distB="0" distL="0" distR="0" simplePos="0" relativeHeight="10" behindDoc="0" locked="0" layoutInCell="0" allowOverlap="1">
             <wp:simplePos x="0" y="0"/>
             <wp:positionH relativeFrom="column">
               <wp:align>center</wp:align>
@@ -1987,7 +1987,7 @@
       <w:r>
         <w:rPr/>
         <w:drawing>
-          <wp:anchor distT="0" distB="0" distL="0" distR="0" simplePos="0" relativeHeight="14" behindDoc="0" locked="0" layoutInCell="0" allowOverlap="1">
+          <wp:anchor distT="0" distB="0" distL="0" distR="0" simplePos="0" relativeHeight="12" behindDoc="0" locked="0" layoutInCell="0" allowOverlap="1">
             <wp:simplePos x="0" y="0"/>
             <wp:positionH relativeFrom="column">
               <wp:align>center</wp:align>
@@ -2143,10 +2143,18 @@
       <w:r>
         <w:rPr/>
         <w:drawing>
-          <wp:inline distT="0" distB="0" distL="0" distR="0">
-            <wp:extent cx="5029200" cy="2639060"/>
+          <wp:anchor distT="0" distB="0" distL="0" distR="0" simplePos="0" relativeHeight="21" behindDoc="0" locked="0" layoutInCell="0" allowOverlap="1">
+            <wp:simplePos x="0" y="0"/>
+            <wp:positionH relativeFrom="column">
+              <wp:align>center</wp:align>
+            </wp:positionH>
+            <wp:positionV relativeFrom="paragraph">
+              <wp:posOffset>635</wp:posOffset>
+            </wp:positionV>
+            <wp:extent cx="5943600" cy="2708275"/>
             <wp:effectExtent l="0" t="0" r="0" b="0"/>
-            <wp:docPr id="12" name="Picture 13"/>
+            <wp:wrapSquare wrapText="largest"/>
+            <wp:docPr id="12" name="Image12"/>
             <wp:cNvGraphicFramePr>
               <a:graphicFrameLocks xmlns:a="http://schemas.openxmlformats.org/drawingml/2006/main" noChangeAspect="1"/>
             </wp:cNvGraphicFramePr>
@@ -2154,7 +2162,7 @@
               <a:graphicData uri="http://schemas.openxmlformats.org/drawingml/2006/picture">
                 <pic:pic xmlns:pic="http://schemas.openxmlformats.org/drawingml/2006/picture">
                   <pic:nvPicPr>
-                    <pic:cNvPr id="12" name="Picture 13"/>
+                    <pic:cNvPr id="12" name="Image12"/>
                     <pic:cNvPicPr>
                       <a:picLocks noChangeAspect="1" noChangeArrowheads="1"/>
                     </pic:cNvPicPr>
@@ -2168,7 +2176,7 @@
                   <pic:spPr bwMode="auto">
                     <a:xfrm>
                       <a:off x="0" y="0"/>
-                      <a:ext cx="5029200" cy="2639060"/>
+                      <a:ext cx="5943600" cy="2708275"/>
                     </a:xfrm>
                     <a:prstGeom prst="rect">
                       <a:avLst/>
@@ -2178,7 +2186,7 @@
                 </pic:pic>
               </a:graphicData>
             </a:graphic>
-          </wp:inline>
+          </wp:anchor>
         </w:drawing>
       </w:r>
     </w:p>
@@ -2206,10 +2214,18 @@
       <w:r>
         <w:rPr/>
         <w:drawing>
-          <wp:inline distT="0" distB="0" distL="0" distR="0">
-            <wp:extent cx="5029200" cy="2639060"/>
+          <wp:anchor distT="0" distB="0" distL="0" distR="0" simplePos="0" relativeHeight="22" behindDoc="0" locked="0" layoutInCell="0" allowOverlap="1">
+            <wp:simplePos x="0" y="0"/>
+            <wp:positionH relativeFrom="column">
+              <wp:align>center</wp:align>
+            </wp:positionH>
+            <wp:positionV relativeFrom="paragraph">
+              <wp:posOffset>635</wp:posOffset>
+            </wp:positionV>
+            <wp:extent cx="7125335" cy="3637280"/>
             <wp:effectExtent l="0" t="0" r="0" b="0"/>
-            <wp:docPr id="13" name="Picture 14"/>
+            <wp:wrapSquare wrapText="largest"/>
+            <wp:docPr id="13" name="Image13"/>
             <wp:cNvGraphicFramePr>
               <a:graphicFrameLocks xmlns:a="http://schemas.openxmlformats.org/drawingml/2006/main" noChangeAspect="1"/>
             </wp:cNvGraphicFramePr>
@@ -2217,7 +2233,7 @@
               <a:graphicData uri="http://schemas.openxmlformats.org/drawingml/2006/picture">
                 <pic:pic xmlns:pic="http://schemas.openxmlformats.org/drawingml/2006/picture">
                   <pic:nvPicPr>
-                    <pic:cNvPr id="13" name="Picture 14"/>
+                    <pic:cNvPr id="13" name="Image13"/>
                     <pic:cNvPicPr>
                       <a:picLocks noChangeAspect="1" noChangeArrowheads="1"/>
                     </pic:cNvPicPr>
@@ -2231,7 +2247,7 @@
                   <pic:spPr bwMode="auto">
                     <a:xfrm>
                       <a:off x="0" y="0"/>
-                      <a:ext cx="5029200" cy="2639060"/>
+                      <a:ext cx="7125335" cy="3637280"/>
                     </a:xfrm>
                     <a:prstGeom prst="rect">
                       <a:avLst/>
@@ -2241,7 +2257,7 @@
                 </pic:pic>
               </a:graphicData>
             </a:graphic>
-          </wp:inline>
+          </wp:anchor>
         </w:drawing>
       </w:r>
     </w:p>
@@ -2354,7 +2370,7 @@
       <w:r>
         <w:rPr/>
         <w:drawing>
-          <wp:anchor distT="0" distB="0" distL="0" distR="0" simplePos="0" relativeHeight="15" behindDoc="0" locked="0" layoutInCell="0" allowOverlap="1">
+          <wp:anchor distT="0" distB="0" distL="0" distR="0" simplePos="0" relativeHeight="13" behindDoc="0" locked="0" layoutInCell="0" allowOverlap="1">
             <wp:simplePos x="0" y="0"/>
             <wp:positionH relativeFrom="column">
               <wp:align>center</wp:align>
@@ -2425,7 +2441,7 @@
       <w:r>
         <w:rPr/>
         <w:drawing>
-          <wp:anchor distT="0" distB="0" distL="0" distR="0" simplePos="0" relativeHeight="16" behindDoc="0" locked="0" layoutInCell="0" allowOverlap="1">
+          <wp:anchor distT="0" distB="0" distL="0" distR="0" simplePos="0" relativeHeight="14" behindDoc="0" locked="0" layoutInCell="0" allowOverlap="1">
             <wp:simplePos x="0" y="0"/>
             <wp:positionH relativeFrom="column">
               <wp:align>center</wp:align>
@@ -2581,7 +2597,7 @@
       <w:r>
         <w:rPr/>
         <w:drawing>
-          <wp:anchor distT="0" distB="0" distL="0" distR="0" simplePos="0" relativeHeight="17" behindDoc="0" locked="0" layoutInCell="0" allowOverlap="1">
+          <wp:anchor distT="0" distB="0" distL="0" distR="0" simplePos="0" relativeHeight="15" behindDoc="0" locked="0" layoutInCell="0" allowOverlap="1">
             <wp:simplePos x="0" y="0"/>
             <wp:positionH relativeFrom="column">
               <wp:align>center</wp:align>
@@ -2652,7 +2668,7 @@
       <w:r>
         <w:rPr/>
         <w:drawing>
-          <wp:anchor distT="0" distB="0" distL="0" distR="0" simplePos="0" relativeHeight="18" behindDoc="0" locked="0" layoutInCell="0" allowOverlap="1">
+          <wp:anchor distT="0" distB="0" distL="0" distR="0" simplePos="0" relativeHeight="16" behindDoc="0" locked="0" layoutInCell="0" allowOverlap="1">
             <wp:simplePos x="0" y="0"/>
             <wp:positionH relativeFrom="column">
               <wp:align>center</wp:align>
@@ -2803,7 +2819,7 @@
       <w:r>
         <w:rPr/>
         <w:drawing>
-          <wp:anchor distT="0" distB="0" distL="0" distR="0" simplePos="0" relativeHeight="19" behindDoc="0" locked="0" layoutInCell="0" allowOverlap="1">
+          <wp:anchor distT="0" distB="0" distL="0" distR="0" simplePos="0" relativeHeight="17" behindDoc="0" locked="0" layoutInCell="0" allowOverlap="1">
             <wp:simplePos x="0" y="0"/>
             <wp:positionH relativeFrom="column">
               <wp:align>center</wp:align>
@@ -2874,7 +2890,7 @@
       <w:r>
         <w:rPr/>
         <w:drawing>
-          <wp:anchor distT="0" distB="0" distL="0" distR="0" simplePos="0" relativeHeight="20" behindDoc="0" locked="0" layoutInCell="0" allowOverlap="1">
+          <wp:anchor distT="0" distB="0" distL="0" distR="0" simplePos="0" relativeHeight="18" behindDoc="0" locked="0" layoutInCell="0" allowOverlap="1">
             <wp:simplePos x="0" y="0"/>
             <wp:positionH relativeFrom="column">
               <wp:align>center</wp:align>
@@ -3762,6 +3778,52 @@
           <w:color w:val="808080"/>
           <w:sz w:val="22"/>
         </w:rPr>
+        <w:drawing>
+          <wp:anchor distT="0" distB="0" distL="0" distR="0" simplePos="0" relativeHeight="20" behindDoc="0" locked="0" layoutInCell="0" allowOverlap="1">
+            <wp:simplePos x="0" y="0"/>
+            <wp:positionH relativeFrom="column">
+              <wp:align>center</wp:align>
+            </wp:positionH>
+            <wp:positionV relativeFrom="paragraph">
+              <wp:posOffset>635</wp:posOffset>
+            </wp:positionV>
+            <wp:extent cx="6858000" cy="4071620"/>
+            <wp:effectExtent l="0" t="0" r="0" b="0"/>
+            <wp:wrapSquare wrapText="largest"/>
+            <wp:docPr id="20" name="Image11"/>
+            <wp:cNvGraphicFramePr>
+              <a:graphicFrameLocks xmlns:a="http://schemas.openxmlformats.org/drawingml/2006/main" noChangeAspect="1"/>
+            </wp:cNvGraphicFramePr>
+            <a:graphic xmlns:a="http://schemas.openxmlformats.org/drawingml/2006/main">
+              <a:graphicData uri="http://schemas.openxmlformats.org/drawingml/2006/picture">
+                <pic:pic xmlns:pic="http://schemas.openxmlformats.org/drawingml/2006/picture">
+                  <pic:nvPicPr>
+                    <pic:cNvPr id="20" name="Image11"/>
+                    <pic:cNvPicPr>
+                      <a:picLocks noChangeAspect="1" noChangeArrowheads="1"/>
+                    </pic:cNvPicPr>
+                  </pic:nvPicPr>
+                  <pic:blipFill>
+                    <a:blip r:embed="rId21"/>
+                    <a:stretch>
+                      <a:fillRect/>
+                    </a:stretch>
+                  </pic:blipFill>
+                  <pic:spPr bwMode="auto">
+                    <a:xfrm>
+                      <a:off x="0" y="0"/>
+                      <a:ext cx="6858000" cy="4071620"/>
+                    </a:xfrm>
+                    <a:prstGeom prst="rect">
+                      <a:avLst/>
+                    </a:prstGeom>
+                    <a:noFill/>
+                  </pic:spPr>
+                </pic:pic>
+              </a:graphicData>
+            </a:graphic>
+          </wp:anchor>
+        </w:drawing>
       </w:r>
     </w:p>
     <w:p>
@@ -4369,7 +4431,7 @@
           <w:sz w:val="22"/>
         </w:rPr>
         <w:drawing>
-          <wp:anchor distT="0" distB="0" distL="0" distR="0" simplePos="0" relativeHeight="21" behindDoc="0" locked="0" layoutInCell="0" allowOverlap="1">
+          <wp:anchor distT="0" distB="0" distL="0" distR="0" simplePos="0" relativeHeight="19" behindDoc="0" locked="0" layoutInCell="0" allowOverlap="1">
             <wp:simplePos x="0" y="0"/>
             <wp:positionH relativeFrom="column">
               <wp:align>center</wp:align>
@@ -4380,7 +4442,7 @@
             <wp:extent cx="5943600" cy="2654300"/>
             <wp:effectExtent l="0" t="0" r="0" b="0"/>
             <wp:wrapSquare wrapText="largest"/>
-            <wp:docPr id="20" name="Image10"/>
+            <wp:docPr id="21" name="Image10"/>
             <wp:cNvGraphicFramePr>
               <a:graphicFrameLocks xmlns:a="http://schemas.openxmlformats.org/drawingml/2006/main" noChangeAspect="1"/>
             </wp:cNvGraphicFramePr>
@@ -4388,13 +4450,13 @@
               <a:graphicData uri="http://schemas.openxmlformats.org/drawingml/2006/picture">
                 <pic:pic xmlns:pic="http://schemas.openxmlformats.org/drawingml/2006/picture">
                   <pic:nvPicPr>
-                    <pic:cNvPr id="20" name="Image10"/>
+                    <pic:cNvPr id="21" name="Image10"/>
                     <pic:cNvPicPr>
                       <a:picLocks noChangeAspect="1" noChangeArrowheads="1"/>
                     </pic:cNvPicPr>
                   </pic:nvPicPr>
                   <pic:blipFill>
-                    <a:blip r:embed="rId21"/>
+                    <a:blip r:embed="rId22"/>
                     <a:stretch>
                       <a:fillRect/>
                     </a:stretch>

</xml_diff>